<commit_message>
Ajoute digest quotidien TransferAI, migration ORG_TARGET, docs et supports en attente
Remplace le cron webinar-admin-weekly-digest (jamais déployé) par
transferai-daily-digest + planification pg_cron correspondante. Ajoute la
migration de backfill ORG_TARGET/DECISION_MAKER_TARGET (item #9 du backlog).
Renforce le masquage du badge Lovable dans index.html. Ajoute les supports
webinaire/vente en attente.

Co-Authored-By: Claude <noreply@anthropic.com>
</commit_message>
<xml_diff>
--- a/outputs/manual-20260705-transferai-background-doc/Programme_Formation_IA_Appliquee_Votre_Metier_Session_29_30_juillet_2026_background_transferai.docx
+++ b/outputs/manual-20260705-transferai-background-doc/Programme_Formation_IA_Appliquee_Votre_Metier_Session_29_30_juillet_2026_background_transferai.docx
@@ -25,66 +25,15 @@
         <w:pStyle w:val="FirstParagraph"/>
       </w:pPr>
       <w:r>
-        <w:rPr>
-          <w:b/>
-          <w:bCs/>
-        </w:rPr>
-        <w:t>Session :</w:t>
-      </w:r>
-      <w:r>
-        <w:t xml:space="preserve"> 29-30 juillet 2026</w:t>
-      </w:r>
-      <w:r>
+        <w:t>Session : 29-30 juillet 2026 &amp; 10-11 Aout 2026</w:t>
         <w:br/>
-      </w:r>
-      <w:r>
-        <w:rPr>
-          <w:b/>
-          <w:bCs/>
-        </w:rPr>
-        <w:t>Format :</w:t>
-      </w:r>
-      <w:r>
-        <w:t xml:space="preserve"> 2 jours en présentiel</w:t>
-      </w:r>
-      <w:r>
+        <w:t>Format : 2 jours en présentiel</w:t>
         <w:br/>
-      </w:r>
-      <w:r>
-        <w:rPr>
-          <w:b/>
-          <w:bCs/>
-        </w:rPr>
-        <w:t>Lieu :</w:t>
-      </w:r>
-      <w:r>
-        <w:t xml:space="preserve"> Riviera 3, Abidjan</w:t>
-      </w:r>
-      <w:r>
+        <w:t>Lieu : Riviera 3, Abidjan</w:t>
         <w:br/>
-      </w:r>
-      <w:r>
-        <w:rPr>
-          <w:b/>
-          <w:bCs/>
-        </w:rPr>
-        <w:t>Capacité :</w:t>
-      </w:r>
-      <w:r>
-        <w:t xml:space="preserve"> 20 participants maximum</w:t>
-      </w:r>
-      <w:r>
+        <w:t>Capacité : 20 participants maximum</w:t>
         <w:br/>
-      </w:r>
-      <w:r>
-        <w:rPr>
-          <w:b/>
-          <w:bCs/>
-        </w:rPr>
-        <w:t>Matériel :</w:t>
-      </w:r>
-      <w:r>
-        <w:t xml:space="preserve"> ordinateurs fournis</w:t>
+        <w:t>Matériel : ordinateurs fournis</w:t>
       </w:r>
     </w:p>
     <w:p>
@@ -993,71 +942,7 @@
         </w:numPr>
       </w:pPr>
       <w:r>
-        <w:rPr>
-          <w:b/>
-          <w:bCs/>
-        </w:rPr>
-        <w:t>1 participant :</w:t>
-      </w:r>
-      <w:r>
-        <w:t xml:space="preserve"> 250 000 F CFA</w:t>
-      </w:r>
-    </w:p>
-    <w:p>
-      <w:pPr>
-        <w:pStyle w:val="Compact"/>
-        <w:numPr>
-          <w:ilvl w:val="0"/>
-          <w:numId w:val="14"/>
-        </w:numPr>
-      </w:pPr>
-      <w:r>
-        <w:rPr>
-          <w:b/>
-          <w:bCs/>
-        </w:rPr>
-        <w:t>Inscriptions groupe :</w:t>
-      </w:r>
-      <w:r>
-        <w:t xml:space="preserve"> tarif dégressif</w:t>
-      </w:r>
-    </w:p>
-    <w:p>
-      <w:pPr>
-        <w:pStyle w:val="Compact"/>
-        <w:numPr>
-          <w:ilvl w:val="0"/>
-          <w:numId w:val="14"/>
-        </w:numPr>
-      </w:pPr>
-      <w:r>
-        <w:rPr>
-          <w:b/>
-          <w:bCs/>
-        </w:rPr>
-        <w:t>6 à 10 participants :</w:t>
-      </w:r>
-      <w:r>
-        <w:t xml:space="preserve"> 165 000 à 185 000 F CFA par participant selon configuration</w:t>
-      </w:r>
-    </w:p>
-    <w:p>
-      <w:pPr>
-        <w:pStyle w:val="Compact"/>
-        <w:numPr>
-          <w:ilvl w:val="0"/>
-          <w:numId w:val="14"/>
-        </w:numPr>
-      </w:pPr>
-      <w:r>
-        <w:rPr>
-          <w:b/>
-          <w:bCs/>
-        </w:rPr>
-        <w:t>10 participants et plus / session intra-entreprise :</w:t>
-      </w:r>
-      <w:r>
-        <w:t xml:space="preserve"> sur devis à partir de 3 500 000 F CFA</w:t>
+        <w:t>Tarifs communiques sur demande.</w:t>
       </w:r>
     </w:p>
     <w:p>

</xml_diff>

<commit_message>
Ajoute charte IA formation, packs prospection, guides CR Réunion et supports connexes
- Charte d'utilisation responsable de l'IA (livrable formation décideurs)
- Packs prospection manuels Attijari CI, ELTON OIL CI, SIR, SMB (courrier + deck + mini-catalogue)
- Guides utilisateur workflow 128 (CR Réunion international, FR/EN/multilingue)
- Documents de différenciation écosystème technologique TransferAI x NettelecomCI
- Export RAG programme formation juillet 2026 et mises à jour supports pré-clôture bancaire/newsletter webinaire

Co-Authored-By: Claude Sonnet 5 <noreply@anthropic.com>
</commit_message>
<xml_diff>
--- a/outputs/manual-20260705-transferai-background-doc/Programme_Formation_IA_Appliquee_Votre_Metier_Session_29_30_juillet_2026_background_transferai.docx
+++ b/outputs/manual-20260705-transferai-background-doc/Programme_Formation_IA_Appliquee_Votre_Metier_Session_29_30_juillet_2026_background_transferai.docx
@@ -26,12 +26,20 @@
       </w:pPr>
       <w:r>
         <w:t>Session : 29-30 juillet 2026 &amp; 10-11 Aout 2026</w:t>
+      </w:r>
+      <w:r>
         <w:br/>
         <w:t>Format : 2 jours en présentiel</w:t>
+      </w:r>
+      <w:r>
         <w:br/>
         <w:t>Lieu : Riviera 3, Abidjan</w:t>
+      </w:r>
+      <w:r>
         <w:br/>
         <w:t>Capacité : 20 participants maximum</w:t>
+      </w:r>
+      <w:r>
         <w:br/>
         <w:t>Matériel : ordinateurs fournis</w:t>
       </w:r>
@@ -942,7 +950,13 @@
         </w:numPr>
       </w:pPr>
       <w:r>
-        <w:t>Tarifs communiques sur demande.</w:t>
+        <w:t>Tarifs communiqu</w:t>
+      </w:r>
+      <w:r>
+        <w:t>é</w:t>
+      </w:r>
+      <w:r>
+        <w:t>s sur demande.</w:t>
       </w:r>
     </w:p>
     <w:p>
@@ -1126,16 +1140,83 @@
 </w:document>
 </file>
 
+<file path=word/endnotes.xml><?xml version="1.0" encoding="utf-8"?>
+<w:endnotes xmlns:wpc="http://schemas.microsoft.com/office/word/2010/wordprocessingCanvas" xmlns:cx="http://schemas.microsoft.com/office/drawing/2014/chartex" xmlns:cx1="http://schemas.microsoft.com/office/drawing/2015/9/8/chartex" xmlns:cx2="http://schemas.microsoft.com/office/drawing/2015/10/21/chartex" xmlns:cx3="http://schemas.microsoft.com/office/drawing/2016/5/9/chartex" xmlns:cx4="http://schemas.microsoft.com/office/drawing/2016/5/10/chartex" xmlns:cx5="http://schemas.microsoft.com/office/drawing/2016/5/11/chartex" xmlns:cx6="http://schemas.microsoft.com/office/drawing/2016/5/12/chartex" xmlns:cx7="http://schemas.microsoft.com/office/drawing/2016/5/13/chartex" xmlns:cx8="http://schemas.microsoft.com/office/drawing/2016/5/14/chartex" xmlns:mc="http://schemas.openxmlformats.org/markup-compatibility/2006" xmlns:m="http://schemas.openxmlformats.org/officeDocument/2006/math" xmlns:aink="http://schemas.microsoft.com/office/drawing/2016/ink" xmlns:am3d="http://schemas.microsoft.com/office/drawing/2017/model3d" xmlns:oel="http://schemas.microsoft.com/office/2019/extlst" xmlns:r="http://schemas.openxmlformats.org/officeDocument/2006/relationships" xmlns:wp14="http://schemas.microsoft.com/office/word/2010/wordprocessingDrawing" xmlns:wp="http://schemas.openxmlformats.org/drawingml/2006/wordprocessingDrawing" xmlns:wpg="http://schemas.microsoft.com/office/word/2010/wordprocessingGroup" xmlns:wpi="http://schemas.microsoft.com/office/word/2010/wordprocessingInk" xmlns:wps="http://schemas.microsoft.com/office/word/2010/wordprocessingShape" xmlns:o="urn:schemas-microsoft-com:office:office" xmlns:v="urn:schemas-microsoft-com:vml" xmlns:w10="urn:schemas-microsoft-com:office:word" xmlns:w="http://schemas.openxmlformats.org/wordprocessingml/2006/main" xmlns:w14="http://schemas.microsoft.com/office/word/2010/wordml" xmlns:w15="http://schemas.microsoft.com/office/word/2012/wordml" xmlns:w16cex="http://schemas.microsoft.com/office/word/2018/wordml/cex" xmlns:w16cid="http://schemas.microsoft.com/office/word/2016/wordml/cid" xmlns:w16="http://schemas.microsoft.com/office/word/2018/wordml" xmlns:w16sdtdh="http://schemas.microsoft.com/office/word/2020/wordml/sdtdatahash" xmlns:w16sdtfl="http://schemas.microsoft.com/office/word/2024/wordml/sdtformatlock" xmlns:w16se="http://schemas.microsoft.com/office/word/2015/wordml/symex" xmlns:w16du="http://schemas.microsoft.com/office/word/2023/wordml/word16du" xmlns:wne="http://schemas.microsoft.com/office/word/2006/wordml" mc:Ignorable="w14 w15 w16se w16cid w16 w16cex w16sdtdh w16sdtfl w16du wp14">
+  <w:endnote w:type="separator" w:id="-1">
+    <w:p>
+      <w:pPr>
+        <w:spacing w:after="0"/>
+      </w:pPr>
+      <w:r>
+        <w:separator/>
+      </w:r>
+    </w:p>
+  </w:endnote>
+  <w:endnote w:type="continuationSeparator" w:id="0">
+    <w:p>
+      <w:pPr>
+        <w:spacing w:after="0"/>
+      </w:pPr>
+      <w:r>
+        <w:continuationSeparator/>
+      </w:r>
+    </w:p>
+  </w:endnote>
+</w:endnotes>
+</file>
+
+<file path=word/footnotes.xml><?xml version="1.0" encoding="utf-8"?>
+<w:footnotes xmlns:wpc="http://schemas.microsoft.com/office/word/2010/wordprocessingCanvas" xmlns:cx="http://schemas.microsoft.com/office/drawing/2014/chartex" xmlns:cx1="http://schemas.microsoft.com/office/drawing/2015/9/8/chartex" xmlns:cx2="http://schemas.microsoft.com/office/drawing/2015/10/21/chartex" xmlns:cx3="http://schemas.microsoft.com/office/drawing/2016/5/9/chartex" xmlns:cx4="http://schemas.microsoft.com/office/drawing/2016/5/10/chartex" xmlns:cx5="http://schemas.microsoft.com/office/drawing/2016/5/11/chartex" xmlns:cx6="http://schemas.microsoft.com/office/drawing/2016/5/12/chartex" xmlns:cx7="http://schemas.microsoft.com/office/drawing/2016/5/13/chartex" xmlns:cx8="http://schemas.microsoft.com/office/drawing/2016/5/14/chartex" xmlns:mc="http://schemas.openxmlformats.org/markup-compatibility/2006" xmlns:m="http://schemas.openxmlformats.org/officeDocument/2006/math" xmlns:aink="http://schemas.microsoft.com/office/drawing/2016/ink" xmlns:am3d="http://schemas.microsoft.com/office/drawing/2017/model3d" xmlns:oel="http://schemas.microsoft.com/office/2019/extlst" xmlns:r="http://schemas.openxmlformats.org/officeDocument/2006/relationships" xmlns:wp14="http://schemas.microsoft.com/office/word/2010/wordprocessingDrawing" xmlns:wp="http://schemas.openxmlformats.org/drawingml/2006/wordprocessingDrawing" xmlns:wpg="http://schemas.microsoft.com/office/word/2010/wordprocessingGroup" xmlns:wpi="http://schemas.microsoft.com/office/word/2010/wordprocessingInk" xmlns:wps="http://schemas.microsoft.com/office/word/2010/wordprocessingShape" xmlns:o="urn:schemas-microsoft-com:office:office" xmlns:v="urn:schemas-microsoft-com:vml" xmlns:w10="urn:schemas-microsoft-com:office:word" xmlns:w="http://schemas.openxmlformats.org/wordprocessingml/2006/main" xmlns:w14="http://schemas.microsoft.com/office/word/2010/wordml" xmlns:w15="http://schemas.microsoft.com/office/word/2012/wordml" xmlns:w16cex="http://schemas.microsoft.com/office/word/2018/wordml/cex" xmlns:w16cid="http://schemas.microsoft.com/office/word/2016/wordml/cid" xmlns:w16="http://schemas.microsoft.com/office/word/2018/wordml" xmlns:w16sdtdh="http://schemas.microsoft.com/office/word/2020/wordml/sdtdatahash" xmlns:w16sdtfl="http://schemas.microsoft.com/office/word/2024/wordml/sdtformatlock" xmlns:w16se="http://schemas.microsoft.com/office/word/2015/wordml/symex" xmlns:w16du="http://schemas.microsoft.com/office/word/2023/wordml/word16du" xmlns:wne="http://schemas.microsoft.com/office/word/2006/wordml" mc:Ignorable="w14 w15 w16se w16cid w16 w16cex w16sdtdh w16sdtfl w16du wp14">
+  <w:footnote w:type="separator" w:id="-1">
+    <w:p>
+      <w:pPr>
+        <w:spacing w:after="0"/>
+      </w:pPr>
+      <w:r>
+        <w:separator/>
+      </w:r>
+    </w:p>
+  </w:footnote>
+  <w:footnote w:type="continuationSeparator" w:id="0">
+    <w:p>
+      <w:pPr>
+        <w:spacing w:after="0"/>
+      </w:pPr>
+      <w:r>
+        <w:continuationSeparator/>
+      </w:r>
+    </w:p>
+  </w:footnote>
+</w:footnotes>
+</file>
+
 <file path=word/header1.xml><?xml version="1.0" encoding="utf-8"?>
-<w:hdr xmlns:m="http://schemas.openxmlformats.org/officeDocument/2006/math" xmlns:mc="http://schemas.openxmlformats.org/markup-compatibility/2006" xmlns:mo="http://schemas.microsoft.com/office/mac/office/2008/main" xmlns:mv="urn:schemas-microsoft-com:mac:vml" xmlns:o="urn:schemas-microsoft-com:office:office" xmlns:r="http://schemas.openxmlformats.org/officeDocument/2006/relationships" xmlns:v="urn:schemas-microsoft-com:vml" xmlns:w10="urn:schemas-microsoft-com:office:word" xmlns:w14="http://schemas.microsoft.com/office/word/2010/wordml" xmlns:w="http://schemas.openxmlformats.org/wordprocessingml/2006/main" xmlns:wne="http://schemas.microsoft.com/office/word/2006/wordml" xmlns:wp14="http://schemas.microsoft.com/office/word/2010/wordprocessingDrawing" xmlns:wp="http://schemas.openxmlformats.org/drawingml/2006/wordprocessingDrawing" xmlns:wpc="http://schemas.microsoft.com/office/word/2010/wordprocessingCanvas" xmlns:wpg="http://schemas.microsoft.com/office/word/2010/wordprocessingGroup" xmlns:wpi="http://schemas.microsoft.com/office/word/2010/wordprocessingInk" xmlns:wps="http://schemas.microsoft.com/office/word/2010/wordprocessingShape" mc:Ignorable="w14 wp14">
+<w:hdr xmlns:wpc="http://schemas.microsoft.com/office/word/2010/wordprocessingCanvas" xmlns:cx="http://schemas.microsoft.com/office/drawing/2014/chartex" xmlns:cx1="http://schemas.microsoft.com/office/drawing/2015/9/8/chartex" xmlns:cx2="http://schemas.microsoft.com/office/drawing/2015/10/21/chartex" xmlns:cx3="http://schemas.microsoft.com/office/drawing/2016/5/9/chartex" xmlns:cx4="http://schemas.microsoft.com/office/drawing/2016/5/10/chartex" xmlns:cx5="http://schemas.microsoft.com/office/drawing/2016/5/11/chartex" xmlns:cx6="http://schemas.microsoft.com/office/drawing/2016/5/12/chartex" xmlns:cx7="http://schemas.microsoft.com/office/drawing/2016/5/13/chartex" xmlns:cx8="http://schemas.microsoft.com/office/drawing/2016/5/14/chartex" xmlns:mc="http://schemas.openxmlformats.org/markup-compatibility/2006" xmlns:m="http://schemas.openxmlformats.org/officeDocument/2006/math" xmlns:aink="http://schemas.microsoft.com/office/drawing/2016/ink" xmlns:am3d="http://schemas.microsoft.com/office/drawing/2017/model3d" xmlns:oel="http://schemas.microsoft.com/office/2019/extlst" xmlns:r="http://schemas.openxmlformats.org/officeDocument/2006/relationships" xmlns:wp14="http://schemas.microsoft.com/office/word/2010/wordprocessingDrawing" xmlns:wp="http://schemas.openxmlformats.org/drawingml/2006/wordprocessingDrawing" xmlns:wpg="http://schemas.microsoft.com/office/word/2010/wordprocessingGroup" xmlns:wpi="http://schemas.microsoft.com/office/word/2010/wordprocessingInk" xmlns:wps="http://schemas.microsoft.com/office/word/2010/wordprocessingShape" xmlns:o="urn:schemas-microsoft-com:office:office" xmlns:v="urn:schemas-microsoft-com:vml" xmlns:w10="urn:schemas-microsoft-com:office:word" xmlns:w="http://schemas.openxmlformats.org/wordprocessingml/2006/main" xmlns:w14="http://schemas.microsoft.com/office/word/2010/wordml" xmlns:w15="http://schemas.microsoft.com/office/word/2012/wordml" xmlns:w16cex="http://schemas.microsoft.com/office/word/2018/wordml/cex" xmlns:w16cid="http://schemas.microsoft.com/office/word/2016/wordml/cid" xmlns:w16="http://schemas.microsoft.com/office/word/2018/wordml" xmlns:w16sdtdh="http://schemas.microsoft.com/office/word/2020/wordml/sdtdatahash" xmlns:w16sdtfl="http://schemas.microsoft.com/office/word/2024/wordml/sdtformatlock" xmlns:w16se="http://schemas.microsoft.com/office/word/2015/wordml/symex" xmlns:w16du="http://schemas.microsoft.com/office/word/2023/wordml/word16du" xmlns:wne="http://schemas.microsoft.com/office/word/2006/wordml" mc:Ignorable="w14 w15 w16se w16cid w16 w16cex w16sdtdh w16sdtfl w16du wp14">
   <w:p>
-    <w:pPr>
-      <w:pStyle w:val="Header"/>
-    </w:pPr>
     <w:r>
-      <w:pict>
-        <v:shape id="TransferAIBackground" o:spid="_x0000_s2049" type="#_x0000_t75" style="position:absolute;width:612.00pt;height:792.00pt;z-index:-251654144;mso-wrap-edited:f;mso-position-horizontal:center;mso-position-horizontal-relative:page;mso-position-vertical:center;mso-position-vertical-relative:page;" stroked="f">
+      <w:pict w14:anchorId="701EC05C">
+        <v:shapetype id="_x0000_t75" coordsize="21600,21600" o:spt="75" o:preferrelative="t" path="m@4@5l@4@11@9@11@9@5xe" filled="f" stroked="f">
+          <v:stroke joinstyle="miter"/>
+          <v:formulas>
+            <v:f eqn="if lineDrawn pixelLineWidth 0"/>
+            <v:f eqn="sum @0 1 0"/>
+            <v:f eqn="sum 0 0 @1"/>
+            <v:f eqn="prod @2 1 2"/>
+            <v:f eqn="prod @3 21600 pixelWidth"/>
+            <v:f eqn="prod @3 21600 pixelHeight"/>
+            <v:f eqn="sum @0 0 1"/>
+            <v:f eqn="prod @6 1 2"/>
+            <v:f eqn="prod @7 21600 pixelWidth"/>
+            <v:f eqn="sum @8 21600 0"/>
+            <v:f eqn="prod @7 21600 pixelHeight"/>
+            <v:f eqn="sum @10 21600 0"/>
+          </v:formulas>
+          <v:path o:extrusionok="f" gradientshapeok="t" o:connecttype="rect"/>
+          <o:lock v:ext="edit" aspectratio="t"/>
+        </v:shapetype>
+        <v:shape id="TransferAIBackground" o:spid="_x0000_s1025" type="#_x0000_t75" alt="" style="position:absolute;margin-left:0;margin-top:0;width:612pt;height:11in;z-index:-251658752;mso-wrap-edited:f;mso-width-percent:0;mso-height-percent:0;mso-position-horizontal:center;mso-position-horizontal-relative:page;mso-position-vertical:center;mso-position-vertical-relative:page;mso-width-percent:0;mso-height-percent:0">
           <v:imagedata r:id="rId1" o:title="TransferAI background"/>
+          <w10:wrap anchorx="page" anchory="page"/>
         </v:shape>
       </w:pict>
     </w:r>

</xml_diff>